<commit_message>
week11: restore README and assignment contract, add missing PDFs, figures and drawio sources
Commit f0c29bc removed README.md and assignment-contract.md, so every
W11 link in README.md, weeks/README.md and docs/ was broken.

- README.md and assignment-contract.md (W11-v1.1) restored without the
  "proposal" banner and with engse206-lab links (not engse206-lab-v2)
- reference/: Completed Sample PDF added; docx updated to the edition
  that says W14 instead of Final (current plan)
- lab/: Worksheets A-D PDF added; Miro images moved into lab/figures/
  with the lab-guide figures (.drawio + PNG)
- assets/: .drawio sources for the 5 Completed Sample figures

Co-Authored-By: Claude Opus 5.5 <noreply@anthropic.com>
Claude-Session: https://claude.ai/code/session_01GHB6YoJV4HauqiQ25bhusB
</commit_message>
<xml_diff>
--- a/weeks/week-11-conceptual-architecture/reference/ENGSE206_Week11_ConceptualArchitecture_v0.3_Completed_Sample.docx
+++ b/weeks/week-11-conceptual-architecture/reference/ENGSE206_Week11_ConceptualArchitecture_v0.3_Completed_Sample.docx
@@ -14069,7 +14069,7 @@
           <w:sz w:val="32"/>
           <w:szCs w:val="32"/>
         </w:rPr>
-        <w:t xml:space="preserve">Final:</w:t>
+        <w:t xml:space="preserve">W14:</w:t>
       </w:r>
       <w:r>
         <w:rPr>
@@ -14082,7 +14082,7 @@
           <w:sz w:val="32"/>
           <w:szCs w:val="32"/>
         </w:rPr>
-        <w:t xml:space="preserve"> Container diagram + decision cards = หน้าแรกของ Developer Handoff</w:t>
+        <w:t xml:space="preserve"> Container diagram + decision cards = หน้าแรกของ Developer Handoff ที่ทีมนำเสนอและส่งมอบให้ Dev</w:t>
       </w:r>
     </w:p>
     <w:p>

</xml_diff>